<commit_message>
Fonctionnement statutaire : slides enrichies, 7 critères de représentativité, article 21
- Slides : contenus étoffés (cartes, encadrés « À retenir », questions de débat,
  schéma CE / bureau / SG, chiffres de la cotisation, deux branches)
- Séquence AG / congrès : l'ordre du jour est remplacé par les 7 critères de
  représentativité (art. L2121-1) ; module congrès : autodiagnostic avec bilan
- Séquence articulations : article 21 des statuts confédéraux
- Sommaire regroupé, cartes des modules décrites, barre d'outils avec compteur ;
  correction du bouton Sommaire de la barre basse qui se refermait aussitôt
- Aide-mémoire formateurs mis à jour (sans date), fiche descriptive en 3 thèmes
- Service worker v12

Co-Authored-By: Claude Opus 5.5 <noreply@anthropic.com>
Claude-Session: https://claude.ai/code/session_016rL7B113spoLeSBdGwEbaY
</commit_message>
<xml_diff>
--- a/documents/Fiche_descriptive_Fonctionnement_statutaire.docx
+++ b/documents/Fiche_descriptive_Fonctionnement_statutaire.docx
@@ -371,7 +371,7 @@
               </w:rPr>
               <w:t xml:space="preserve">Supports en ligne : </w:t>
             </w:r>
-            <w:hyperlink w:history="1" r:id="rIdvlfm2zsot7t8qe-by6mns">
+            <w:hyperlink w:history="1" r:id="rIdun3e4mbedvt0mwtzbwh6b">
               <w:r>
                 <w:rPr>
                   <w:rStyle w:val="Hyperlink"/>
@@ -630,178 +630,74 @@
           </w:p>
           <w:p>
             <w:pPr>
-              <w:spacing w:after="40" w:before="0" w:line="276"/>
-              <w:jc w:val="left"/>
-            </w:pPr>
-            <w:r>
-              <w:rPr>
-                <w:rFonts w:ascii="Calibri" w:cs="Calibri" w:eastAsia="Calibri" w:hAnsi="Calibri"/>
-                <w:sz w:val="22"/>
-                <w:szCs w:val="22"/>
-              </w:rPr>
-              <w:t xml:space="preserve">Thème 1 : </w:t>
-            </w:r>
-            <w:r>
-              <w:rPr>
-                <w:rFonts w:ascii="Calibri" w:cs="Calibri" w:eastAsia="Calibri" w:hAnsi="Calibri"/>
-                <w:sz w:val="22"/>
-                <w:szCs w:val="22"/>
-              </w:rPr>
-              <w:t xml:space="preserve">Pourquoi un fonctionnement statutaire ? Les statuts, garants de la démocratie syndicale.</w:t>
-            </w:r>
-          </w:p>
-          <w:p>
-            <w:pPr>
-              <w:spacing w:after="40" w:before="0" w:line="276"/>
-              <w:jc w:val="left"/>
-            </w:pPr>
-            <w:r>
-              <w:rPr>
-                <w:rFonts w:ascii="Calibri" w:cs="Calibri" w:eastAsia="Calibri" w:hAnsi="Calibri"/>
-                <w:sz w:val="22"/>
-                <w:szCs w:val="22"/>
-              </w:rPr>
-              <w:t xml:space="preserve">Thème 2 : </w:t>
-            </w:r>
-            <w:r>
-              <w:rPr>
-                <w:rFonts w:ascii="Calibri" w:cs="Calibri" w:eastAsia="Calibri" w:hAnsi="Calibri"/>
-                <w:sz w:val="22"/>
-                <w:szCs w:val="22"/>
-              </w:rPr>
-              <w:t xml:space="preserve">Le rôle des adhérent·es : droits, devoirs et pouvoir d'intervention.</w:t>
-            </w:r>
-          </w:p>
-          <w:p>
-            <w:pPr>
-              <w:spacing w:after="40" w:before="0" w:line="276"/>
-              <w:jc w:val="left"/>
-            </w:pPr>
-            <w:r>
-              <w:rPr>
-                <w:rFonts w:ascii="Calibri" w:cs="Calibri" w:eastAsia="Calibri" w:hAnsi="Calibri"/>
-                <w:sz w:val="22"/>
-                <w:szCs w:val="22"/>
-              </w:rPr>
-              <w:t xml:space="preserve">Thème 3 : </w:t>
-            </w:r>
-            <w:r>
-              <w:rPr>
-                <w:rFonts w:ascii="Calibri" w:cs="Calibri" w:eastAsia="Calibri" w:hAnsi="Calibri"/>
-                <w:sz w:val="22"/>
-                <w:szCs w:val="22"/>
-              </w:rPr>
-              <w:t xml:space="preserve">Élu·es, mandaté·es, désigné·es, responsables : les différences et les engagements.</w:t>
-            </w:r>
-          </w:p>
-          <w:p>
-            <w:pPr>
-              <w:spacing w:after="40" w:before="0" w:line="276"/>
-              <w:jc w:val="left"/>
-            </w:pPr>
-            <w:r>
-              <w:rPr>
-                <w:rFonts w:ascii="Calibri" w:cs="Calibri" w:eastAsia="Calibri" w:hAnsi="Calibri"/>
-                <w:sz w:val="22"/>
-                <w:szCs w:val="22"/>
-              </w:rPr>
-              <w:t xml:space="preserve">Thème 4 : </w:t>
-            </w:r>
-            <w:r>
-              <w:rPr>
-                <w:rFonts w:ascii="Calibri" w:cs="Calibri" w:eastAsia="Calibri" w:hAnsi="Calibri"/>
-                <w:sz w:val="22"/>
-                <w:szCs w:val="22"/>
-              </w:rPr>
-              <w:t xml:space="preserve">Commission exécutive, bureau, secrétaire général·e, commission financière de contrôle : qui fait quoi ?</w:t>
-            </w:r>
-          </w:p>
-          <w:p>
-            <w:pPr>
-              <w:spacing w:after="40" w:before="0" w:line="276"/>
-              <w:jc w:val="left"/>
-            </w:pPr>
-            <w:r>
-              <w:rPr>
-                <w:rFonts w:ascii="Calibri" w:cs="Calibri" w:eastAsia="Calibri" w:hAnsi="Calibri"/>
-                <w:sz w:val="22"/>
-                <w:szCs w:val="22"/>
-              </w:rPr>
-              <w:t xml:space="preserve">Thème 5 : </w:t>
-            </w:r>
-            <w:r>
-              <w:rPr>
-                <w:rFonts w:ascii="Calibri" w:cs="Calibri" w:eastAsia="Calibri" w:hAnsi="Calibri"/>
-                <w:sz w:val="22"/>
-                <w:szCs w:val="22"/>
-              </w:rPr>
-              <w:t xml:space="preserve">Assemblée générale et congrès : les lieux de souveraineté.</w:t>
-            </w:r>
-          </w:p>
-          <w:p>
-            <w:pPr>
-              <w:spacing w:after="40" w:before="0" w:line="276"/>
-              <w:jc w:val="left"/>
-            </w:pPr>
-            <w:r>
-              <w:rPr>
-                <w:rFonts w:ascii="Calibri" w:cs="Calibri" w:eastAsia="Calibri" w:hAnsi="Calibri"/>
-                <w:sz w:val="22"/>
-                <w:szCs w:val="22"/>
-              </w:rPr>
-              <w:t xml:space="preserve">Thème 6 : </w:t>
-            </w:r>
-            <w:r>
-              <w:rPr>
-                <w:rFonts w:ascii="Calibri" w:cs="Calibri" w:eastAsia="Calibri" w:hAnsi="Calibri"/>
-                <w:sz w:val="22"/>
-                <w:szCs w:val="22"/>
-              </w:rPr>
-              <w:t xml:space="preserve">La cotisation et les outils de la CGT (CoGéTise, CoGiTiel).</w:t>
-            </w:r>
-          </w:p>
-          <w:p>
-            <w:pPr>
-              <w:spacing w:after="40" w:before="0" w:line="276"/>
-              <w:jc w:val="left"/>
-            </w:pPr>
-            <w:r>
-              <w:rPr>
-                <w:rFonts w:ascii="Calibri" w:cs="Calibri" w:eastAsia="Calibri" w:hAnsi="Calibri"/>
-                <w:sz w:val="22"/>
-                <w:szCs w:val="22"/>
-              </w:rPr>
-              <w:t xml:space="preserve">Thème 7 : </w:t>
-            </w:r>
-            <w:r>
-              <w:rPr>
-                <w:rFonts w:ascii="Calibri" w:cs="Calibri" w:eastAsia="Calibri" w:hAnsi="Calibri"/>
-                <w:sz w:val="22"/>
-                <w:szCs w:val="22"/>
-              </w:rPr>
-              <w:t xml:space="preserve">L'articulation du syndicat avec l'union locale, l'union départementale, la fédération et la Confédération.</w:t>
-            </w:r>
-          </w:p>
-          <w:p>
-            <w:pPr>
-              <w:spacing w:after="40" w:before="0" w:line="276"/>
-              <w:jc w:val="left"/>
-            </w:pPr>
-            <w:r>
-              <w:rPr>
-                <w:rFonts w:ascii="Calibri" w:cs="Calibri" w:eastAsia="Calibri" w:hAnsi="Calibri"/>
-                <w:sz w:val="22"/>
-                <w:szCs w:val="22"/>
-              </w:rPr>
-              <w:t xml:space="preserve">Thème 8 : </w:t>
-            </w:r>
-            <w:r>
-              <w:rPr>
-                <w:rFonts w:ascii="Calibri" w:cs="Calibri" w:eastAsia="Calibri" w:hAnsi="Calibri"/>
-                <w:sz w:val="22"/>
-                <w:szCs w:val="22"/>
-              </w:rPr>
-              <w:t xml:space="preserve">Synthèse et engagements pour son syndicat.</w:t>
+              <w:spacing w:after="80" w:before="0" w:line="276"/>
+              <w:jc w:val="both"/>
+            </w:pPr>
+            <w:r>
+              <w:rPr>
+                <w:rFonts w:ascii="Calibri" w:cs="Calibri" w:eastAsia="Calibri" w:hAnsi="Calibri"/>
+                <w:b/>
+                <w:bCs/>
+                <w:sz w:val="22"/>
+                <w:szCs w:val="22"/>
+              </w:rPr>
+              <w:t xml:space="preserve">Thème 1 : Les statuts, garants de la démocratie syndicale. </w:t>
+            </w:r>
+            <w:r>
+              <w:rPr>
+                <w:rFonts w:ascii="Calibri" w:cs="Calibri" w:eastAsia="Calibri" w:hAnsi="Calibri"/>
+                <w:sz w:val="22"/>
+                <w:szCs w:val="22"/>
+              </w:rPr>
+              <w:t xml:space="preserve">Pourquoi un fonctionnement statutaire ; les droits, les devoirs et le pouvoir d'intervention des adhérent·es ; élu·es, mandaté·es, désigné·es et responsables : les différences et les engagements.</w:t>
+            </w:r>
+          </w:p>
+          <w:p>
+            <w:pPr>
+              <w:spacing w:after="80" w:before="0" w:line="276"/>
+              <w:jc w:val="both"/>
+            </w:pPr>
+            <w:r>
+              <w:rPr>
+                <w:rFonts w:ascii="Calibri" w:cs="Calibri" w:eastAsia="Calibri" w:hAnsi="Calibri"/>
+                <w:b/>
+                <w:bCs/>
+                <w:sz w:val="22"/>
+                <w:szCs w:val="22"/>
+              </w:rPr>
+              <w:t xml:space="preserve">Thème 2 : Les instances du syndicat et sa représentativité. </w:t>
+            </w:r>
+            <w:r>
+              <w:rPr>
+                <w:rFonts w:ascii="Calibri" w:cs="Calibri" w:eastAsia="Calibri" w:hAnsi="Calibri"/>
+                <w:sz w:val="22"/>
+                <w:szCs w:val="22"/>
+              </w:rPr>
+              <w:t xml:space="preserve">Commission exécutive, bureau, secrétaire général·e et commission financière de contrôle ; l'assemblée générale et le congrès, lieux de souveraineté ; les 7 critères de représentativité (art. L2121-1 du Code du travail) ; la cotisation et les outils de la CGT (CoGéTise, CoGiTiel).</w:t>
+            </w:r>
+          </w:p>
+          <w:p>
+            <w:pPr>
+              <w:spacing w:after="80" w:before="0" w:line="276"/>
+              <w:jc w:val="both"/>
+            </w:pPr>
+            <w:r>
+              <w:rPr>
+                <w:rFonts w:ascii="Calibri" w:cs="Calibri" w:eastAsia="Calibri" w:hAnsi="Calibri"/>
+                <w:b/>
+                <w:bCs/>
+                <w:sz w:val="22"/>
+                <w:szCs w:val="22"/>
+              </w:rPr>
+              <w:t xml:space="preserve">Thème 3 : Le syndicat dans la CGT. </w:t>
+            </w:r>
+            <w:r>
+              <w:rPr>
+                <w:rFonts w:ascii="Calibri" w:cs="Calibri" w:eastAsia="Calibri" w:hAnsi="Calibri"/>
+                <w:sz w:val="22"/>
+                <w:szCs w:val="22"/>
+              </w:rPr>
+              <w:t xml:space="preserve">L'articulation avec l'union locale, l'union départementale, la fédération et la Confédération ; les deux branches, professionnelle et territoriale ; l'article 21 des statuts confédéraux (coopération et complémentarité entre organisations) ; les engagements de chacun·e pour son syndicat.</w:t>
             </w:r>
           </w:p>
           <w:p>
@@ -865,7 +761,7 @@
                 <w:sz w:val="22"/>
                 <w:szCs w:val="22"/>
               </w:rPr>
-              <w:t xml:space="preserve">Évaluations formatives en cours de stage à l'occasion des activités (tri des rôles, organigramme, simulation de vote, quiz).</w:t>
+              <w:t xml:space="preserve">Évaluations formatives en cours de stage à l'occasion des activités (tri des rôles, organigramme, autodiagnostic des 7 critères de représentativité, simulation de vote, quiz).</w:t>
             </w:r>
           </w:p>
           <w:p>

</xml_diff>

<commit_message>
Fiche descriptive : coordonnées de l'UD et contenu mis à jour
- Adresse, code postal, téléphone et courriel de l'UD CGT de l'Aveyron
- Contexte : représentativité, AG de syndiqué·es et AG de salarié·es, article 21
- Thème 2 : AG de syndiqué·es et AG ouvrière, cotisation de 1 % net
- Prérequis : formation « Découvrir la CGT » ; apporter les statuts de son syndicat
- Évaluations : activités sur le syndicat de chaque stagiaire (sans simulation de vote)
- Forme et supports : pédagogie active, diaporama pas à pas, modules en parcours
  guidé, support stagiaire, fiche « Le rôle de chacun »

Co-Authored-By: Claude Opus 5.5 <noreply@anthropic.com>
Claude-Session: https://claude.ai/code/session_016rL7B113spoLeSBdGwEbaY
</commit_message>
<xml_diff>
--- a/documents/Fiche_descriptive_Fonctionnement_statutaire.docx
+++ b/documents/Fiche_descriptive_Fonctionnement_statutaire.docx
@@ -262,7 +262,7 @@
                 <w:sz w:val="22"/>
                 <w:szCs w:val="22"/>
               </w:rPr>
-              <w:t xml:space="preserve">Adresse : ……………………………………………</w:t>
+              <w:t xml:space="preserve">Adresse : 50 rue Raynal</w:t>
             </w:r>
           </w:p>
           <w:p>
@@ -276,7 +276,7 @@
                 <w:sz w:val="22"/>
                 <w:szCs w:val="22"/>
               </w:rPr>
-              <w:t xml:space="preserve">Code postal, ville : …………………………………</w:t>
+              <w:t xml:space="preserve">Code postal, ville : 12000 Rodez</w:t>
             </w:r>
           </w:p>
         </w:tc>
@@ -308,7 +308,7 @@
                 <w:sz w:val="22"/>
                 <w:szCs w:val="22"/>
               </w:rPr>
-              <w:t xml:space="preserve">Tél : ……………………………</w:t>
+              <w:t xml:space="preserve">Tél : 05 65 68 22 30</w:t>
             </w:r>
           </w:p>
         </w:tc>
@@ -355,8 +355,19 @@
                 <w:sz w:val="22"/>
                 <w:szCs w:val="22"/>
               </w:rPr>
-              <w:t xml:space="preserve">Courriel : ……………………………………………………………</w:t>
-            </w:r>
+              <w:t xml:space="preserve">Courriel : </w:t>
+            </w:r>
+            <w:hyperlink w:history="1" r:id="rIdl0sbphxh9fgi5db6_gwqp">
+              <w:r>
+                <w:rPr>
+                  <w:rStyle w:val="Hyperlink"/>
+                  <w:rFonts w:ascii="Calibri" w:cs="Calibri" w:eastAsia="Calibri" w:hAnsi="Calibri"/>
+                  <w:sz w:val="22"/>
+                  <w:szCs w:val="22"/>
+                </w:rPr>
+                <w:t xml:space="preserve">ud@cgt12.fr</w:t>
+              </w:r>
+            </w:hyperlink>
           </w:p>
           <w:p>
             <w:pPr>
@@ -371,7 +382,7 @@
               </w:rPr>
               <w:t xml:space="preserve">Supports en ligne : </w:t>
             </w:r>
-            <w:hyperlink w:history="1" r:id="rIdun3e4mbedvt0mwtzbwh6b">
+            <w:hyperlink w:history="1" r:id="rIdmjlwun87aaumvqoz1lubt">
               <w:r>
                 <w:rPr>
                   <w:rStyle w:val="Hyperlink"/>
@@ -575,7 +586,21 @@
                 <w:sz w:val="22"/>
                 <w:szCs w:val="22"/>
               </w:rPr>
-              <w:t xml:space="preserve">Enfin, situer son syndicat dans la CGT (union locale, union départementale, fédération, Confédération) et comprendre le circuit de la cotisation permet de mieux s'appuyer sur l'ensemble de l'organisation.</w:t>
+              <w:t xml:space="preserve">Faire vivre ses statuts, c'est aussi remplir les critères qui fondent la représentativité du syndicat (Code du travail, art. L2121-1) et distinguer l'AG de syndiqué·es, où le syndicat construit ses propositions, de l'AG de salarié·es, où les salarié·es décident de leur action.</w:t>
+            </w:r>
+          </w:p>
+          <w:p>
+            <w:pPr>
+              <w:spacing w:after="80" w:before="0" w:line="276"/>
+              <w:jc w:val="both"/>
+            </w:pPr>
+            <w:r>
+              <w:rPr>
+                <w:rFonts w:ascii="Calibri" w:cs="Calibri" w:eastAsia="Calibri" w:hAnsi="Calibri"/>
+                <w:sz w:val="22"/>
+                <w:szCs w:val="22"/>
+              </w:rPr>
+              <w:t xml:space="preserve">Enfin, situer son syndicat dans la CGT (union locale, union départementale, fédération, Confédération), dans l'esprit de coopération de l'article 21 des statuts confédéraux, et comprendre le circuit de la cotisation permet de mieux s'appuyer sur l'ensemble de l'organisation.</w:t>
             </w:r>
           </w:p>
           <w:p>
@@ -673,7 +698,7 @@
                 <w:sz w:val="22"/>
                 <w:szCs w:val="22"/>
               </w:rPr>
-              <w:t xml:space="preserve">Commission exécutive, bureau, secrétaire général·e et commission financière de contrôle ; l'assemblée générale et le congrès, lieux de souveraineté ; les 7 critères de représentativité (art. L2121-1 du Code du travail) ; la cotisation et les outils de la CGT (CoGéTise, CoGiTiel).</w:t>
+              <w:t xml:space="preserve">Commission exécutive, bureau, secrétaire général·e et commission financière de contrôle ; le congrès et l'assemblée générale, lieux de souveraineté ; l'AG de syndiqué·es et l'AG de salarié·es (« AG ouvrière »), qui vient toujours après ; les 7 critères de représentativité (art. L2121-1 du Code du travail) ; la cotisation de 1 % net et les outils de la CGT (CoGéTise, CoGiTiel).</w:t>
             </w:r>
           </w:p>
           <w:p>
@@ -729,7 +754,7 @@
                 <w:sz w:val="22"/>
                 <w:szCs w:val="22"/>
               </w:rPr>
-              <w:t xml:space="preserve">Être syndiqué·e à la CGT. Il est souhaitable d'avoir suivi la formation « S'impliquer dans la CGT » ou la formation syndicale générale de niveau 1.</w:t>
+              <w:t xml:space="preserve">Être syndiqué·e à la CGT. Il est souhaitable d'avoir suivi la formation « Découvrir la CGT » ou la formation syndicale générale de niveau 1. Chaque stagiaire est invité·e à apporter les statuts de son syndicat.</w:t>
             </w:r>
           </w:p>
           <w:p>
@@ -761,7 +786,7 @@
                 <w:sz w:val="22"/>
                 <w:szCs w:val="22"/>
               </w:rPr>
-              <w:t xml:space="preserve">Évaluations formatives en cours de stage à l'occasion des activités (tri des rôles, organigramme, autodiagnostic des 7 critères de représentativité, simulation de vote, quiz).</w:t>
+              <w:t xml:space="preserve">Évaluations formatives en cours de stage, à partir des activités sur le syndicat de chaque stagiaire : comparaison de ses statuts avec le modèle, classement des instances, autodiagnostic des 7 critères de représentativité, distinction AG de syndiqué·es / AG de salarié·es, quiz de fin de séquence.</w:t>
             </w:r>
           </w:p>
           <w:p>
@@ -807,21 +832,21 @@
                 <w:sz w:val="22"/>
                 <w:szCs w:val="22"/>
               </w:rPr>
-              <w:t xml:space="preserve">Journée d'étude de 1 jour (de 9 h à 17 h), en pédagogie active.</w:t>
-            </w:r>
-          </w:p>
-          <w:p>
-            <w:pPr>
-              <w:spacing w:after="80" w:before="0" w:line="276"/>
-              <w:jc w:val="both"/>
-            </w:pPr>
-            <w:r>
-              <w:rPr>
-                <w:rFonts w:ascii="Calibri" w:cs="Calibri" w:eastAsia="Calibri" w:hAnsi="Calibri"/>
-                <w:sz w:val="22"/>
-                <w:szCs w:val="22"/>
-              </w:rPr>
-              <w:t xml:space="preserve">Supports : diaporama interactif, modules en ligne (rôles, statuts, congrès, cotisations), support stagiaire, statuts types et chartes de la CGT.</w:t>
+              <w:t xml:space="preserve">Journée d'étude de 1 jour (de 9 h à 17 h), en pédagogie active : on part du vécu des stagiaires et de leur syndicat, le groupe débat avant chaque apport, et chacun·e repart avec un engagement concret.</w:t>
+            </w:r>
+          </w:p>
+          <w:p>
+            <w:pPr>
+              <w:spacing w:after="80" w:before="0" w:line="276"/>
+              <w:jc w:val="both"/>
+            </w:pPr>
+            <w:r>
+              <w:rPr>
+                <w:rFonts w:ascii="Calibri" w:cs="Calibri" w:eastAsia="Calibri" w:hAnsi="Calibri"/>
+                <w:sz w:val="22"/>
+                <w:szCs w:val="22"/>
+              </w:rPr>
+              <w:t xml:space="preserve">Supports : diaporama projeté avec révélation pas à pas ; quatre modules interactifs en parcours guidé (statuts, rôles, AG et congrès, cotisations) ; support stagiaire à compléter ; fiche « Le rôle de chacun dans le syndicat » ; modèle de statuts et chartes de la CGT.</w:t>
             </w:r>
           </w:p>
         </w:tc>

</xml_diff>